<commit_message>
Update 2 Disst Docs
</commit_message>
<xml_diff>
--- a/disst/dt_docs/00_MASTER_CHECKLIST.docx
+++ b/disst/dt_docs/00_MASTER_CHECKLIST.docx
@@ -55,33 +55,7 @@
           <w:color w:val="505050"/>
           <w:sz w:val="22"/>
         </w:rPr>
-        <w:t>Reference: DISSERTATION_FORMATTING.md</w:t>
-      </w:r>
-    </w:p>
-    <w:p>
-      <w:pPr>
-        <w:spacing w:before="40" w:after="40" w:line="360" w:lineRule="auto"/>
-      </w:pPr>
-      <w:r>
-        <w:rPr>
-          <w:rFonts w:ascii="Times New Roman" w:hAnsi="Times New Roman"/>
-          <w:i/>
-          <w:color w:val="505050"/>
-          <w:sz w:val="22"/>
-        </w:rPr>
         <w:t>Update status as: [ ] = Pending | [x] = Done | [~] = In Progress</w:t>
-      </w:r>
-    </w:p>
-    <w:p>
-      <w:pPr>
-        <w:spacing w:before="80" w:after="80" w:line="360" w:lineRule="auto"/>
-      </w:pPr>
-      <w:r>
-        <w:rPr>
-          <w:color w:val="B4B4B4"/>
-          <w:sz w:val="20"/>
-        </w:rPr>
-        <w:t>------------------------------------------------------------</w:t>
       </w:r>
     </w:p>
     <w:p>
@@ -1220,18 +1194,6 @@
           <w:sz w:val="24"/>
         </w:rPr>
         <w:t>[ ] Find 20–25 more Indian stock market / NIFTY specific papers</w:t>
-      </w:r>
-    </w:p>
-    <w:p>
-      <w:pPr>
-        <w:spacing w:before="80" w:after="80" w:line="360" w:lineRule="auto"/>
-      </w:pPr>
-      <w:r>
-        <w:rPr>
-          <w:color w:val="B4B4B4"/>
-          <w:sz w:val="20"/>
-        </w:rPr>
-        <w:t>------------------------------------------------------------</w:t>
       </w:r>
     </w:p>
     <w:p>
@@ -2622,18 +2584,6 @@
     </w:p>
     <w:p>
       <w:pPr>
-        <w:spacing w:before="80" w:after="80" w:line="360" w:lineRule="auto"/>
-      </w:pPr>
-      <w:r>
-        <w:rPr>
-          <w:color w:val="B4B4B4"/>
-          <w:sz w:val="20"/>
-        </w:rPr>
-        <w:t>------------------------------------------------------------</w:t>
-      </w:r>
-    </w:p>
-    <w:p>
-      <w:pPr>
         <w:spacing w:before="160" w:after="80" w:line="360" w:lineRule="auto"/>
       </w:pPr>
       <w:r>
@@ -3086,18 +3036,6 @@
     </w:p>
     <w:p>
       <w:pPr>
-        <w:spacing w:before="80" w:after="80" w:line="360" w:lineRule="auto"/>
-      </w:pPr>
-      <w:r>
-        <w:rPr>
-          <w:color w:val="B4B4B4"/>
-          <w:sz w:val="20"/>
-        </w:rPr>
-        <w:t>------------------------------------------------------------</w:t>
-      </w:r>
-    </w:p>
-    <w:p>
-      <w:pPr>
         <w:spacing w:before="160" w:after="80" w:line="360" w:lineRule="auto"/>
       </w:pPr>
       <w:r>
@@ -3256,18 +3194,6 @@
     </w:p>
     <w:p>
       <w:pPr>
-        <w:spacing w:before="80" w:after="80" w:line="360" w:lineRule="auto"/>
-      </w:pPr>
-      <w:r>
-        <w:rPr>
-          <w:color w:val="B4B4B4"/>
-          <w:sz w:val="20"/>
-        </w:rPr>
-        <w:t>------------------------------------------------------------</w:t>
-      </w:r>
-    </w:p>
-    <w:p>
-      <w:pPr>
         <w:spacing w:before="160" w:after="80" w:line="360" w:lineRule="auto"/>
       </w:pPr>
       <w:r>
@@ -3394,18 +3320,6 @@
     </w:p>
     <w:p>
       <w:pPr>
-        <w:spacing w:before="80" w:after="80" w:line="360" w:lineRule="auto"/>
-      </w:pPr>
-      <w:r>
-        <w:rPr>
-          <w:color w:val="B4B4B4"/>
-          <w:sz w:val="20"/>
-        </w:rPr>
-        <w:t>------------------------------------------------------------</w:t>
-      </w:r>
-    </w:p>
-    <w:p>
-      <w:pPr>
         <w:spacing w:before="160" w:after="80" w:line="360" w:lineRule="auto"/>
       </w:pPr>
       <w:r>
@@ -3516,18 +3430,6 @@
     </w:p>
     <w:p>
       <w:pPr>
-        <w:spacing w:before="80" w:after="80" w:line="360" w:lineRule="auto"/>
-      </w:pPr>
-      <w:r>
-        <w:rPr>
-          <w:color w:val="B4B4B4"/>
-          <w:sz w:val="20"/>
-        </w:rPr>
-        <w:t>------------------------------------------------------------</w:t>
-      </w:r>
-    </w:p>
-    <w:p>
-      <w:pPr>
         <w:spacing w:before="160" w:after="80" w:line="360" w:lineRule="auto"/>
       </w:pPr>
       <w:r>
@@ -3638,18 +3540,6 @@
     </w:p>
     <w:p>
       <w:pPr>
-        <w:spacing w:before="80" w:after="80" w:line="360" w:lineRule="auto"/>
-      </w:pPr>
-      <w:r>
-        <w:rPr>
-          <w:color w:val="B4B4B4"/>
-          <w:sz w:val="20"/>
-        </w:rPr>
-        <w:t>------------------------------------------------------------</w:t>
-      </w:r>
-    </w:p>
-    <w:p>
-      <w:pPr>
         <w:spacing w:before="160" w:after="80" w:line="360" w:lineRule="auto"/>
       </w:pPr>
       <w:r>
@@ -3728,18 +3618,6 @@
     </w:p>
     <w:p>
       <w:pPr>
-        <w:spacing w:before="80" w:after="80" w:line="360" w:lineRule="auto"/>
-      </w:pPr>
-      <w:r>
-        <w:rPr>
-          <w:color w:val="B4B4B4"/>
-          <w:sz w:val="20"/>
-        </w:rPr>
-        <w:t>------------------------------------------------------------</w:t>
-      </w:r>
-    </w:p>
-    <w:p>
-      <w:pPr>
         <w:spacing w:before="160" w:after="80" w:line="360" w:lineRule="auto"/>
       </w:pPr>
       <w:r>
@@ -3814,18 +3692,6 @@
           <w:sz w:val="24"/>
         </w:rPr>
         <w:t>[ ] Bring all hardbound copies to viva hall</w:t>
-      </w:r>
-    </w:p>
-    <w:p>
-      <w:pPr>
-        <w:spacing w:before="80" w:after="80" w:line="360" w:lineRule="auto"/>
-      </w:pPr>
-      <w:r>
-        <w:rPr>
-          <w:color w:val="B4B4B4"/>
-          <w:sz w:val="20"/>
-        </w:rPr>
-        <w:t>------------------------------------------------------------</w:t>
       </w:r>
     </w:p>
     <w:p>
@@ -4691,48 +4557,6 @@
       </w:tr>
     </w:tbl>
     <w:p/>
-    <w:p>
-      <w:pPr>
-        <w:spacing w:before="80" w:after="80" w:line="360" w:lineRule="auto"/>
-      </w:pPr>
-      <w:r>
-        <w:rPr>
-          <w:color w:val="B4B4B4"/>
-          <w:sz w:val="20"/>
-        </w:rPr>
-        <w:t>------------------------------------------------------------</w:t>
-      </w:r>
-    </w:p>
-    <w:p>
-      <w:pPr>
-        <w:spacing w:before="0" w:after="120" w:line="360" w:lineRule="auto"/>
-      </w:pPr>
-      <w:r>
-        <w:rPr>
-          <w:rFonts w:ascii="Times New Roman" w:hAnsi="Times New Roman"/>
-          <w:b w:val="0"/>
-          <w:i w:val="0"/>
-          <w:sz w:val="24"/>
-        </w:rPr>
-      </w:r>
-      <w:r>
-        <w:rPr>
-          <w:rFonts w:ascii="Times New Roman" w:hAnsi="Times New Roman"/>
-          <w:b w:val="0"/>
-          <w:i/>
-          <w:sz w:val="24"/>
-        </w:rPr>
-        <w:t>Last updated: 2026-04-30</w:t>
-      </w:r>
-      <w:r>
-        <w:rPr>
-          <w:rFonts w:ascii="Times New Roman" w:hAnsi="Times New Roman"/>
-          <w:b w:val="0"/>
-          <w:i w:val="0"/>
-          <w:sz w:val="24"/>
-        </w:rPr>
-      </w:r>
-    </w:p>
     <w:sectPr>
       <w:pgSz w:w="11906" w:h="16838"/>
       <w:pgMar w:top="1440" w:right="1440" w:bottom="1440" w:left="2154" w:header="720" w:footer="720" w:gutter="0"/>

</xml_diff>